<commit_message>
docs: standardize proper typography, headers, margins, and academic layout across all practical files and unified master manual
</commit_message>
<xml_diff>
--- a/Documents/24DIT021_AWDF_P10.docx
+++ b/Documents/24DIT021_AWDF_P10.docx
@@ -4,23 +4,34 @@
   <w:body>
     <w:p>
       <w:pPr>
-        <w:spacing w:after="80"/>
+        <w:spacing w:before="240" w:after="60"/>
+        <w:jc w:val="center"/>
       </w:pPr>
       <w:r>
         <w:rPr>
+          <w:rFonts w:ascii="Times New Roman" w:hAnsi="Times New Roman"/>
           <w:b/>
-          <w:sz w:val="64"/>
+          <w:i w:val="0"/>
+          <w:color w:val="0F172A"/>
+          <w:sz w:val="44"/>
+          <w:rFonts w:ascii="Times New Roman" w:hAnsi="Times New Roman" w:cs="Times New Roman"/>
         </w:rPr>
         <w:t>PRACTICAL 10</w:t>
       </w:r>
     </w:p>
     <w:p>
       <w:pPr>
-        <w:spacing w:after="40"/>
+        <w:spacing w:after="60"/>
+        <w:jc w:val="center"/>
       </w:pPr>
       <w:r>
         <w:rPr>
-          <w:sz w:val="24"/>
+          <w:rFonts w:ascii="Times New Roman" w:hAnsi="Times New Roman"/>
+          <w:b/>
+          <w:i w:val="0"/>
+          <w:color w:val="1E293B"/>
+          <w:sz w:val="32"/>
+          <w:rFonts w:ascii="Times New Roman" w:hAnsi="Times New Roman" w:cs="Times New Roman"/>
         </w:rPr>
         <w:t>Asynchronous Processing with Event-Driven Architecture</w:t>
       </w:r>
@@ -28,10 +39,16 @@
     <w:p>
       <w:pPr>
         <w:spacing w:after="40"/>
+        <w:jc w:val="center"/>
       </w:pPr>
       <w:r>
         <w:rPr>
+          <w:rFonts w:ascii="Times New Roman" w:hAnsi="Times New Roman"/>
+          <w:b/>
+          <w:i w:val="0"/>
+          <w:color w:val="334155"/>
           <w:sz w:val="24"/>
+          <w:rFonts w:ascii="Times New Roman" w:hAnsi="Times New Roman" w:cs="Times New Roman"/>
         </w:rPr>
         <w:t>Roll No:- 24DIT021</w:t>
       </w:r>
@@ -39,10 +56,16 @@
     <w:p>
       <w:pPr>
         <w:spacing w:after="40"/>
+        <w:jc w:val="center"/>
       </w:pPr>
       <w:r>
         <w:rPr>
-          <w:sz w:val="24"/>
+          <w:rFonts w:ascii="Times New Roman" w:hAnsi="Times New Roman"/>
+          <w:b w:val="0"/>
+          <w:i w:val="0"/>
+          <w:color w:val="334155"/>
+          <w:sz w:val="22"/>
+          <w:rFonts w:ascii="Times New Roman" w:hAnsi="Times New Roman" w:cs="Times New Roman"/>
         </w:rPr>
         <w:t>Subject: Advanced Web Development Frameworks (ITUE301)</w:t>
       </w:r>
@@ -50,10 +73,16 @@
     <w:p>
       <w:pPr>
         <w:spacing w:after="40"/>
+        <w:jc w:val="center"/>
       </w:pPr>
       <w:r>
         <w:rPr>
-          <w:sz w:val="24"/>
+          <w:rFonts w:ascii="Times New Roman" w:hAnsi="Times New Roman"/>
+          <w:b w:val="0"/>
+          <w:i w:val="0"/>
+          <w:color w:val="334155"/>
+          <w:sz w:val="22"/>
+          <w:rFonts w:ascii="Times New Roman" w:hAnsi="Times New Roman" w:cs="Times New Roman"/>
         </w:rPr>
         <w:t>Semester: 5th Semester B.Tech Information Technology</w:t>
       </w:r>
@@ -61,391 +90,654 @@
     <w:p>
       <w:pPr>
         <w:spacing w:after="40"/>
+        <w:jc w:val="center"/>
       </w:pPr>
       <w:r>
         <w:rPr>
-          <w:sz w:val="24"/>
+          <w:rFonts w:ascii="Times New Roman" w:hAnsi="Times New Roman"/>
+          <w:b w:val="0"/>
+          <w:i w:val="0"/>
+          <w:color w:val="334155"/>
+          <w:sz w:val="22"/>
+          <w:rFonts w:ascii="Times New Roman" w:hAnsi="Times New Roman" w:cs="Times New Roman"/>
         </w:rPr>
         <w:t>Faculty of Technology and Engineering, CHARUSAT</w:t>
       </w:r>
     </w:p>
     <w:p>
       <w:pPr>
-        <w:spacing w:after="160"/>
+        <w:spacing w:after="120"/>
       </w:pPr>
     </w:p>
     <w:p>
       <w:pPr>
-        <w:spacing w:before="280" w:after="120"/>
+        <w:spacing w:before="240" w:after="80"/>
       </w:pPr>
       <w:r>
         <w:rPr>
+          <w:rFonts w:ascii="Times New Roman" w:hAnsi="Times New Roman"/>
           <w:b/>
-          <w:sz w:val="40"/>
+          <w:i w:val="0"/>
+          <w:color w:val="0F172A"/>
+          <w:sz w:val="32"/>
+          <w:rFonts w:ascii="Times New Roman" w:hAnsi="Times New Roman" w:cs="Times New Roman"/>
         </w:rPr>
         <w:t>1. Problem Statement</w:t>
       </w:r>
     </w:p>
     <w:p>
       <w:pPr>
-        <w:spacing w:after="120" w:line="276" w:lineRule="auto"/>
+        <w:spacing w:after="80" w:line="276" w:lineRule="auto"/>
       </w:pPr>
       <w:r>
         <w:rPr>
+          <w:rFonts w:ascii="Times New Roman" w:hAnsi="Times New Roman"/>
+          <w:b w:val="0"/>
+          <w:i w:val="0"/>
+          <w:color w:val="1E293B"/>
           <w:sz w:val="22"/>
+          <w:rFonts w:ascii="Times New Roman" w:hAnsi="Times New Roman" w:cs="Times New Roman"/>
         </w:rPr>
         <w:t>Implement non-blocking asynchronous background processing in Node.js using native EventEmitter without external dependencies. Decouple notification dispatching and audit logging from the main request path, ensuring the HTTP 201 response returns immediately before the background listener finishes executing.</w:t>
       </w:r>
     </w:p>
     <w:p>
       <w:pPr>
-        <w:spacing w:before="280" w:after="120"/>
+        <w:spacing w:before="240" w:after="80"/>
       </w:pPr>
       <w:r>
         <w:rPr>
+          <w:rFonts w:ascii="Times New Roman" w:hAnsi="Times New Roman"/>
           <w:b/>
-          <w:sz w:val="40"/>
+          <w:i w:val="0"/>
+          <w:color w:val="0F172A"/>
+          <w:sz w:val="32"/>
+          <w:rFonts w:ascii="Times New Roman" w:hAnsi="Times New Roman" w:cs="Times New Roman"/>
         </w:rPr>
         <w:t>2. Objective</w:t>
       </w:r>
     </w:p>
     <w:p>
       <w:pPr>
-        <w:spacing w:after="120" w:line="276" w:lineRule="auto"/>
+        <w:spacing w:after="80" w:line="276" w:lineRule="auto"/>
       </w:pPr>
       <w:r>
         <w:rPr>
+          <w:rFonts w:ascii="Times New Roman" w:hAnsi="Times New Roman"/>
+          <w:b w:val="0"/>
+          <w:i w:val="0"/>
+          <w:color w:val="1E293B"/>
           <w:sz w:val="22"/>
+          <w:rFonts w:ascii="Times New Roman" w:hAnsi="Times New Roman" w:cs="Times New Roman"/>
         </w:rPr>
         <w:t>To decouple auxiliary side-effects from the critical HTTP request-response path using Node.js event-driven primitives.</w:t>
       </w:r>
     </w:p>
     <w:p>
       <w:pPr>
-        <w:spacing w:before="280" w:after="120"/>
+        <w:spacing w:before="240" w:after="80"/>
       </w:pPr>
       <w:r>
         <w:rPr>
+          <w:rFonts w:ascii="Times New Roman" w:hAnsi="Times New Roman"/>
           <w:b/>
-          <w:sz w:val="40"/>
+          <w:i w:val="0"/>
+          <w:color w:val="0F172A"/>
+          <w:sz w:val="32"/>
+          <w:rFonts w:ascii="Times New Roman" w:hAnsi="Times New Roman" w:cs="Times New Roman"/>
         </w:rPr>
         <w:t>3. Theory / Concepts Used</w:t>
       </w:r>
     </w:p>
     <w:p>
       <w:pPr>
-        <w:pStyle w:val="ListParagraph"/>
+        <w:pStyle w:val="ListBullet"/>
         <w:spacing w:after="60" w:line="276" w:lineRule="auto"/>
       </w:pPr>
       <w:r>
         <w:rPr>
+          <w:rFonts w:ascii="Times New Roman" w:hAnsi="Times New Roman"/>
+          <w:b w:val="0"/>
+          <w:i w:val="0"/>
+          <w:color w:val="1E293B"/>
           <w:sz w:val="22"/>
+          <w:rFonts w:ascii="Times New Roman" w:hAnsi="Times New Roman" w:cs="Times New Roman"/>
         </w:rPr>
         <w:t>Node.js native EventEmitter facilitates loosely coupled communication where publishers emit named events and registered listeners react asynchronously.</w:t>
       </w:r>
     </w:p>
     <w:p>
       <w:pPr>
-        <w:pStyle w:val="ListParagraph"/>
+        <w:pStyle w:val="ListBullet"/>
         <w:spacing w:after="60" w:line="276" w:lineRule="auto"/>
       </w:pPr>
       <w:r>
         <w:rPr>
+          <w:rFonts w:ascii="Times New Roman" w:hAnsi="Times New Roman"/>
+          <w:b w:val="0"/>
+          <w:i w:val="0"/>
+          <w:color w:val="1E293B"/>
           <w:sz w:val="22"/>
+          <w:rFonts w:ascii="Times New Roman" w:hAnsi="Times New Roman" w:cs="Times New Roman"/>
         </w:rPr>
         <w:t>Decoupling side-effects (e.g. notifications, logging, telemetry) keeps user-facing API response latency low.</w:t>
       </w:r>
     </w:p>
     <w:p>
       <w:pPr>
-        <w:pStyle w:val="ListParagraph"/>
+        <w:pStyle w:val="ListBullet"/>
         <w:spacing w:after="60" w:line="276" w:lineRule="auto"/>
       </w:pPr>
       <w:r>
         <w:rPr>
+          <w:rFonts w:ascii="Times New Roman" w:hAnsi="Times New Roman"/>
+          <w:b w:val="0"/>
+          <w:i w:val="0"/>
+          <w:color w:val="1E293B"/>
           <w:sz w:val="22"/>
+          <w:rFonts w:ascii="Times New Roman" w:hAnsi="Times New Roman" w:cs="Times New Roman"/>
         </w:rPr>
         <w:t>The Node.js event loop prioritizes completing active socket writes before draining background timer and microtask queues.</w:t>
       </w:r>
     </w:p>
     <w:p>
       <w:pPr>
-        <w:pStyle w:val="ListParagraph"/>
+        <w:pStyle w:val="ListBullet"/>
         <w:spacing w:after="60" w:line="276" w:lineRule="auto"/>
       </w:pPr>
       <w:r>
         <w:rPr>
+          <w:rFonts w:ascii="Times New Roman" w:hAnsi="Times New Roman"/>
+          <w:b w:val="0"/>
+          <w:i w:val="0"/>
+          <w:color w:val="1E293B"/>
           <w:sz w:val="22"/>
+          <w:rFonts w:ascii="Times New Roman" w:hAnsi="Times New Roman" w:cs="Times New Roman"/>
         </w:rPr>
         <w:t>Unhandled 'error' events in EventEmitter throw uncaught exceptions; a dedicated error listener is mandatory.</w:t>
       </w:r>
     </w:p>
     <w:p>
       <w:pPr>
-        <w:spacing w:before="280" w:after="120"/>
+        <w:spacing w:before="240" w:after="80"/>
       </w:pPr>
       <w:r>
         <w:rPr>
+          <w:rFonts w:ascii="Times New Roman" w:hAnsi="Times New Roman"/>
           <w:b/>
-          <w:sz w:val="40"/>
+          <w:i w:val="0"/>
+          <w:color w:val="0F172A"/>
+          <w:sz w:val="32"/>
+          <w:rFonts w:ascii="Times New Roman" w:hAnsi="Times New Roman" w:cs="Times New Roman"/>
         </w:rPr>
         <w:t>4. Solution Approach</w:t>
       </w:r>
     </w:p>
     <w:p>
       <w:pPr>
-        <w:pStyle w:val="ListParagraph"/>
+        <w:pStyle w:val="ListNumber"/>
         <w:spacing w:after="60" w:line="276" w:lineRule="auto"/>
       </w:pPr>
       <w:r>
         <w:rPr>
+          <w:rFonts w:ascii="Times New Roman" w:hAnsi="Times New Roman"/>
+          <w:b w:val="0"/>
+          <w:i w:val="0"/>
+          <w:color w:val="1E293B"/>
           <w:sz w:val="22"/>
+          <w:rFonts w:ascii="Times New Roman" w:hAnsi="Times New Roman" w:cs="Times New Roman"/>
         </w:rPr>
         <w:t>Create events.js exporting a singleton TaskEvents instance extending EventEmitter.</w:t>
       </w:r>
     </w:p>
     <w:p>
       <w:pPr>
-        <w:pStyle w:val="ListParagraph"/>
+        <w:pStyle w:val="ListNumber"/>
         <w:spacing w:after="60" w:line="276" w:lineRule="auto"/>
       </w:pPr>
       <w:r>
         <w:rPr>
+          <w:rFonts w:ascii="Times New Roman" w:hAnsi="Times New Roman"/>
+          <w:b w:val="0"/>
+          <w:i w:val="0"/>
+          <w:color w:val="1E293B"/>
           <w:sz w:val="22"/>
+          <w:rFonts w:ascii="Times New Roman" w:hAnsi="Times New Roman" w:cs="Times New Roman"/>
         </w:rPr>
         <w:t>Create listeners.js registering handlers for 'task-created', 'task-deleted', and 'error'.</w:t>
       </w:r>
     </w:p>
     <w:p>
       <w:pPr>
-        <w:pStyle w:val="ListParagraph"/>
+        <w:pStyle w:val="ListNumber"/>
         <w:spacing w:after="60" w:line="276" w:lineRule="auto"/>
       </w:pPr>
       <w:r>
         <w:rPr>
+          <w:rFonts w:ascii="Times New Roman" w:hAnsi="Times New Roman"/>
+          <w:b w:val="0"/>
+          <w:i w:val="0"/>
+          <w:color w:val="1E293B"/>
           <w:sz w:val="22"/>
+          <w:rFonts w:ascii="Times New Roman" w:hAnsi="Times New Roman" w:cs="Times New Roman"/>
         </w:rPr>
         <w:t>Simulate non-blocking async notification latency (400ms setTimeout) in the task-created listener.</w:t>
       </w:r>
     </w:p>
     <w:p>
       <w:pPr>
-        <w:pStyle w:val="ListParagraph"/>
+        <w:pStyle w:val="ListNumber"/>
         <w:spacing w:after="60" w:line="276" w:lineRule="auto"/>
       </w:pPr>
       <w:r>
         <w:rPr>
+          <w:rFonts w:ascii="Times New Roman" w:hAnsi="Times New Roman"/>
+          <w:b w:val="0"/>
+          <w:i w:val="0"/>
+          <w:color w:val="1E293B"/>
           <w:sz w:val="22"/>
+          <w:rFonts w:ascii="Times New Roman" w:hAnsi="Times New Roman" w:cs="Times New Roman"/>
         </w:rPr>
         <w:t>In taskRoutes.js POST /tasks, send the HTTP 201 response to the client first.</w:t>
       </w:r>
     </w:p>
     <w:p>
       <w:pPr>
-        <w:pStyle w:val="ListParagraph"/>
+        <w:pStyle w:val="ListNumber"/>
         <w:spacing w:after="60" w:line="276" w:lineRule="auto"/>
       </w:pPr>
       <w:r>
         <w:rPr>
+          <w:rFonts w:ascii="Times New Roman" w:hAnsi="Times New Roman"/>
+          <w:b w:val="0"/>
+          <w:i w:val="0"/>
+          <w:color w:val="1E293B"/>
           <w:sz w:val="22"/>
+          <w:rFonts w:ascii="Times New Roman" w:hAnsi="Times New Roman" w:cs="Times New Roman"/>
         </w:rPr>
         <w:t>Emit 'task-created' immediately after responding and log timestamps to prove non-blocking execution order.</w:t>
       </w:r>
     </w:p>
     <w:p>
       <w:pPr>
-        <w:pStyle w:val="ListParagraph"/>
+        <w:pStyle w:val="ListNumber"/>
         <w:spacing w:after="60" w:line="276" w:lineRule="auto"/>
       </w:pPr>
       <w:r>
         <w:rPr>
+          <w:rFonts w:ascii="Times New Roman" w:hAnsi="Times New Roman"/>
+          <w:b w:val="0"/>
+          <w:i w:val="0"/>
+          <w:color w:val="1E293B"/>
           <w:sz w:val="22"/>
+          <w:rFonts w:ascii="Times New Roman" w:hAnsi="Times New Roman" w:cs="Times New Roman"/>
         </w:rPr>
         <w:t>Initialize listeners on server startup in server.js.</w:t>
       </w:r>
     </w:p>
     <w:p>
       <w:pPr>
-        <w:spacing w:before="280" w:after="120"/>
+        <w:spacing w:before="240" w:after="80"/>
       </w:pPr>
       <w:r>
         <w:rPr>
+          <w:rFonts w:ascii="Times New Roman" w:hAnsi="Times New Roman"/>
           <w:b/>
-          <w:sz w:val="40"/>
+          <w:i w:val="0"/>
+          <w:color w:val="0F172A"/>
+          <w:sz w:val="32"/>
+          <w:rFonts w:ascii="Times New Roman" w:hAnsi="Times New Roman" w:cs="Times New Roman"/>
         </w:rPr>
         <w:t>5. Architecture and Workflow Diagram</w:t>
       </w:r>
     </w:p>
+    <w:tbl>
+      <w:tblPr>
+        <w:tblW w:type="auto" w:w="0"/>
+        <w:jc w:val="center"/>
+        <w:tblLayout w:type="fixed"/>
+        <w:tblLook w:firstColumn="1" w:firstRow="1" w:lastColumn="0" w:lastRow="0" w:noHBand="0" w:noVBand="1" w:val="04A0"/>
+      </w:tblPr>
+      <w:tblGrid>
+        <w:gridCol w:w="10080"/>
+      </w:tblGrid>
+      <w:tr>
+        <w:tc>
+          <w:tcPr>
+            <w:tcW w:type="dxa" w:w="9792"/>
+            <w:shd w:fill="F8FAFC"/>
+            <w:tcBorders>
+              <w:top w:val="single" w:sz="4" w:space="0" w:color="E2E8F0"/>
+              <w:left w:val="single" w:sz="12" w:space="0" w:color="3B82F6"/>
+              <w:bottom w:val="single" w:sz="4" w:space="0" w:color="E2E8F0"/>
+              <w:right w:val="single" w:sz="4" w:space="0" w:color="E2E8F0"/>
+            </w:tcBorders>
+            <w:tcMar>
+              <w:top w:w="120" w:type="dxa"/>
+              <w:bottom w:w="120" w:type="dxa"/>
+              <w:left w:w="160" w:type="dxa"/>
+              <w:right w:w="160" w:type="dxa"/>
+            </w:tcMar>
+          </w:tcPr>
+          <w:p>
+            <w:pPr>
+              <w:spacing w:before="40" w:after="40" w:line="252" w:lineRule="auto"/>
+            </w:pPr>
+            <w:r>
+              <w:rPr>
+                <w:rFonts w:ascii="Consolas" w:hAnsi="Consolas"/>
+                <w:b w:val="0"/>
+                <w:i w:val="0"/>
+                <w:color w:val="1E293B"/>
+                <w:sz w:val="18"/>
+                <w:rFonts w:ascii="Consolas" w:hAnsi="Consolas" w:cs="Consolas"/>
+              </w:rPr>
+              <w:t xml:space="preserve">Client (POST /tasks) </w:t>
+              <w:br/>
+              <w:t xml:space="preserve">       |</w:t>
+              <w:br/>
+              <w:t xml:space="preserve">       v</w:t>
+              <w:br/>
+              <w:t>Express Route Handler</w:t>
+              <w:br/>
+              <w:t xml:space="preserve">       ├── 1. Save Task to MongoDB</w:t>
+              <w:br/>
+              <w:t xml:space="preserve">       ├── 2. Send HTTP 201 Response Immediately (timestamp: T1)</w:t>
+              <w:br/>
+              <w:t xml:space="preserve">       └── 3. emit('task-created', task)</w:t>
+              <w:br/>
+              <w:t xml:space="preserve">               |</w:t>
+              <w:br/>
+              <w:t xml:space="preserve">               v (handled asynchronously in background)</w:t>
+              <w:br/>
+              <w:t xml:space="preserve">        Notification Listener ➔ Simulates Email Dispatch ➔ Completes at T2 (T2 &gt; T1)</w:t>
+            </w:r>
+          </w:p>
+        </w:tc>
+      </w:tr>
+    </w:tbl>
     <w:p>
       <w:pPr>
-        <w:spacing w:before="80" w:after="120"/>
-        <w:ind w:left="288"/>
+        <w:spacing w:after="80"/>
+      </w:pPr>
+    </w:p>
+    <w:p>
+      <w:pPr>
+        <w:spacing w:before="240" w:after="80"/>
       </w:pPr>
       <w:r>
         <w:rPr>
-          <w:rFonts w:ascii="Consolas" w:hAnsi="Consolas"/>
-          <w:color w:val="1E293B"/>
-          <w:sz w:val="19"/>
-        </w:rPr>
-        <w:t xml:space="preserve">Client (POST /tasks) </w:t>
-        <w:br/>
-        <w:t xml:space="preserve">       |</w:t>
-        <w:br/>
-        <w:t xml:space="preserve">       v</w:t>
-        <w:br/>
-        <w:t>Express Route Handler</w:t>
-        <w:br/>
-        <w:t xml:space="preserve">       ├── 1. Save Task to MongoDB</w:t>
-        <w:br/>
-        <w:t xml:space="preserve">       ├── 2. Send HTTP 201 Response Immediately (timestamp: T1)</w:t>
-        <w:br/>
-        <w:t xml:space="preserve">       └── 3. emit('task-created', task)</w:t>
-        <w:br/>
-        <w:t xml:space="preserve">               |</w:t>
-        <w:br/>
-        <w:t xml:space="preserve">               v (handled asynchronously in background)</w:t>
-        <w:br/>
-        <w:t xml:space="preserve">        Notification Listener ➔ Simulates Email Dispatch ➔ Completes at T2 (T2 &gt; T1)</w:t>
-      </w:r>
-    </w:p>
-    <w:p>
-      <w:pPr>
-        <w:spacing w:before="280" w:after="120"/>
-      </w:pPr>
-      <w:r>
-        <w:rPr>
+          <w:rFonts w:ascii="Times New Roman" w:hAnsi="Times New Roman"/>
           <w:b/>
-          <w:sz w:val="40"/>
+          <w:i w:val="0"/>
+          <w:color w:val="0F172A"/>
+          <w:sz w:val="32"/>
+          <w:rFonts w:ascii="Times New Roman" w:hAnsi="Times New Roman" w:cs="Times New Roman"/>
         </w:rPr>
         <w:t>6. Key Implementation Code Snippets</w:t>
       </w:r>
     </w:p>
     <w:p>
       <w:pPr>
-        <w:spacing w:before="200" w:after="80"/>
+        <w:spacing w:before="160" w:after="40"/>
       </w:pPr>
       <w:r>
         <w:rPr>
+          <w:rFonts w:ascii="Times New Roman" w:hAnsi="Times New Roman"/>
           <w:b/>
-          <w:sz w:val="28"/>
+          <w:i w:val="0"/>
+          <w:color w:val="1E293B"/>
+          <w:sz w:val="24"/>
+          <w:rFonts w:ascii="Times New Roman" w:hAnsi="Times New Roman" w:cs="Times New Roman"/>
         </w:rPr>
         <w:t>Source File: events.js</w:t>
       </w:r>
     </w:p>
+    <w:tbl>
+      <w:tblPr>
+        <w:tblW w:type="auto" w:w="0"/>
+        <w:jc w:val="center"/>
+        <w:tblLayout w:type="fixed"/>
+        <w:tblLook w:firstColumn="1" w:firstRow="1" w:lastColumn="0" w:lastRow="0" w:noHBand="0" w:noVBand="1" w:val="04A0"/>
+      </w:tblPr>
+      <w:tblGrid>
+        <w:gridCol w:w="10080"/>
+      </w:tblGrid>
+      <w:tr>
+        <w:tc>
+          <w:tcPr>
+            <w:tcW w:type="dxa" w:w="9792"/>
+            <w:shd w:fill="F8FAFC"/>
+            <w:tcBorders>
+              <w:top w:val="single" w:sz="4" w:space="0" w:color="E2E8F0"/>
+              <w:left w:val="single" w:sz="12" w:space="0" w:color="3B82F6"/>
+              <w:bottom w:val="single" w:sz="4" w:space="0" w:color="E2E8F0"/>
+              <w:right w:val="single" w:sz="4" w:space="0" w:color="E2E8F0"/>
+            </w:tcBorders>
+            <w:tcMar>
+              <w:top w:w="120" w:type="dxa"/>
+              <w:bottom w:w="120" w:type="dxa"/>
+              <w:left w:w="160" w:type="dxa"/>
+              <w:right w:w="160" w:type="dxa"/>
+            </w:tcMar>
+          </w:tcPr>
+          <w:p>
+            <w:pPr>
+              <w:spacing w:before="40" w:after="40" w:line="252" w:lineRule="auto"/>
+            </w:pPr>
+            <w:r>
+              <w:rPr>
+                <w:rFonts w:ascii="Consolas" w:hAnsi="Consolas"/>
+                <w:b w:val="0"/>
+                <w:i w:val="0"/>
+                <w:color w:val="1E293B"/>
+                <w:sz w:val="18"/>
+                <w:rFonts w:ascii="Consolas" w:hAnsi="Consolas" w:cs="Consolas"/>
+              </w:rPr>
+              <w:t>import { EventEmitter } from 'events';</w:t>
+              <w:br/>
+              <w:t>class TaskEvents extends EventEmitter {}</w:t>
+              <w:br/>
+              <w:t>export const taskEvents = new TaskEvents();</w:t>
+              <w:br/>
+              <w:t>export default taskEvents;</w:t>
+            </w:r>
+          </w:p>
+        </w:tc>
+      </w:tr>
+    </w:tbl>
     <w:p>
       <w:pPr>
-        <w:spacing w:before="80" w:after="120"/>
-        <w:ind w:left="288"/>
+        <w:spacing w:after="80"/>
+      </w:pPr>
+    </w:p>
+    <w:p>
+      <w:pPr>
+        <w:spacing w:before="160" w:after="40"/>
       </w:pPr>
       <w:r>
         <w:rPr>
-          <w:rFonts w:ascii="Consolas" w:hAnsi="Consolas"/>
+          <w:rFonts w:ascii="Times New Roman" w:hAnsi="Times New Roman"/>
+          <w:b/>
+          <w:i w:val="0"/>
           <w:color w:val="1E293B"/>
-          <w:sz w:val="19"/>
-        </w:rPr>
-        <w:t>import { EventEmitter } from 'events';</w:t>
-        <w:br/>
-        <w:t>class TaskEvents extends EventEmitter {}</w:t>
-        <w:br/>
-        <w:t>export const taskEvents = new TaskEvents();</w:t>
-        <w:br/>
-        <w:t>export default taskEvents;</w:t>
-      </w:r>
-    </w:p>
-    <w:p>
-      <w:pPr>
-        <w:spacing w:before="200" w:after="80"/>
-      </w:pPr>
-      <w:r>
-        <w:rPr>
-          <w:b/>
-          <w:sz w:val="28"/>
+          <w:sz w:val="24"/>
+          <w:rFonts w:ascii="Times New Roman" w:hAnsi="Times New Roman" w:cs="Times New Roman"/>
         </w:rPr>
         <w:t>Source File: listeners.js</w:t>
       </w:r>
     </w:p>
+    <w:tbl>
+      <w:tblPr>
+        <w:tblW w:type="auto" w:w="0"/>
+        <w:jc w:val="center"/>
+        <w:tblLayout w:type="fixed"/>
+        <w:tblLook w:firstColumn="1" w:firstRow="1" w:lastColumn="0" w:lastRow="0" w:noHBand="0" w:noVBand="1" w:val="04A0"/>
+      </w:tblPr>
+      <w:tblGrid>
+        <w:gridCol w:w="10080"/>
+      </w:tblGrid>
+      <w:tr>
+        <w:tc>
+          <w:tcPr>
+            <w:tcW w:type="dxa" w:w="9792"/>
+            <w:shd w:fill="F8FAFC"/>
+            <w:tcBorders>
+              <w:top w:val="single" w:sz="4" w:space="0" w:color="E2E8F0"/>
+              <w:left w:val="single" w:sz="12" w:space="0" w:color="3B82F6"/>
+              <w:bottom w:val="single" w:sz="4" w:space="0" w:color="E2E8F0"/>
+              <w:right w:val="single" w:sz="4" w:space="0" w:color="E2E8F0"/>
+            </w:tcBorders>
+            <w:tcMar>
+              <w:top w:w="120" w:type="dxa"/>
+              <w:bottom w:w="120" w:type="dxa"/>
+              <w:left w:w="160" w:type="dxa"/>
+              <w:right w:w="160" w:type="dxa"/>
+            </w:tcMar>
+          </w:tcPr>
+          <w:p>
+            <w:pPr>
+              <w:spacing w:before="40" w:after="40" w:line="252" w:lineRule="auto"/>
+            </w:pPr>
+            <w:r>
+              <w:rPr>
+                <w:rFonts w:ascii="Consolas" w:hAnsi="Consolas"/>
+                <w:b w:val="0"/>
+                <w:i w:val="0"/>
+                <w:color w:val="1E293B"/>
+                <w:sz w:val="18"/>
+                <w:rFonts w:ascii="Consolas" w:hAnsi="Consolas" w:cs="Consolas"/>
+              </w:rPr>
+              <w:t>taskEvents.on('task-created', (task) =&gt; {</w:t>
+              <w:br/>
+              <w:t xml:space="preserve">  setTimeout(() =&gt; {</w:t>
+              <w:br/>
+              <w:t xml:space="preserve">    console.log(`[ASYNC NOTIFICATION] Email sent for "${task.title}" at ${new Date().toISOString()}`);</w:t>
+              <w:br/>
+              <w:t xml:space="preserve">  }, 400);</w:t>
+              <w:br/>
+              <w:t>});</w:t>
+            </w:r>
+          </w:p>
+        </w:tc>
+      </w:tr>
+    </w:tbl>
     <w:p>
       <w:pPr>
-        <w:spacing w:before="80" w:after="120"/>
-        <w:ind w:left="288"/>
+        <w:spacing w:after="80"/>
+      </w:pPr>
+    </w:p>
+    <w:p>
+      <w:pPr>
+        <w:spacing w:before="160" w:after="40"/>
       </w:pPr>
       <w:r>
         <w:rPr>
-          <w:rFonts w:ascii="Consolas" w:hAnsi="Consolas"/>
+          <w:rFonts w:ascii="Times New Roman" w:hAnsi="Times New Roman"/>
+          <w:b/>
+          <w:i w:val="0"/>
           <w:color w:val="1E293B"/>
-          <w:sz w:val="19"/>
-        </w:rPr>
-        <w:t>taskEvents.on('task-created', (task) =&gt; {</w:t>
-        <w:br/>
-        <w:t xml:space="preserve">  setTimeout(() =&gt; {</w:t>
-        <w:br/>
-        <w:t xml:space="preserve">    console.log(`[ASYNC NOTIFICATION] Email sent for "${task.title}" at ${new Date().toISOString()}`);</w:t>
-        <w:br/>
-        <w:t xml:space="preserve">  }, 400);</w:t>
-        <w:br/>
-        <w:t>});</w:t>
-      </w:r>
-    </w:p>
-    <w:p>
-      <w:pPr>
-        <w:spacing w:before="200" w:after="80"/>
-      </w:pPr>
-      <w:r>
-        <w:rPr>
-          <w:b/>
-          <w:sz w:val="28"/>
+          <w:sz w:val="24"/>
+          <w:rFonts w:ascii="Times New Roman" w:hAnsi="Times New Roman" w:cs="Times New Roman"/>
         </w:rPr>
         <w:t>Source File: routes/taskRoutes.js</w:t>
       </w:r>
     </w:p>
+    <w:tbl>
+      <w:tblPr>
+        <w:tblW w:type="auto" w:w="0"/>
+        <w:jc w:val="center"/>
+        <w:tblLayout w:type="fixed"/>
+        <w:tblLook w:firstColumn="1" w:firstRow="1" w:lastColumn="0" w:lastRow="0" w:noHBand="0" w:noVBand="1" w:val="04A0"/>
+      </w:tblPr>
+      <w:tblGrid>
+        <w:gridCol w:w="10080"/>
+      </w:tblGrid>
+      <w:tr>
+        <w:tc>
+          <w:tcPr>
+            <w:tcW w:type="dxa" w:w="9792"/>
+            <w:shd w:fill="F8FAFC"/>
+            <w:tcBorders>
+              <w:top w:val="single" w:sz="4" w:space="0" w:color="E2E8F0"/>
+              <w:left w:val="single" w:sz="12" w:space="0" w:color="3B82F6"/>
+              <w:bottom w:val="single" w:sz="4" w:space="0" w:color="E2E8F0"/>
+              <w:right w:val="single" w:sz="4" w:space="0" w:color="E2E8F0"/>
+            </w:tcBorders>
+            <w:tcMar>
+              <w:top w:w="120" w:type="dxa"/>
+              <w:bottom w:w="120" w:type="dxa"/>
+              <w:left w:w="160" w:type="dxa"/>
+              <w:right w:w="160" w:type="dxa"/>
+            </w:tcMar>
+          </w:tcPr>
+          <w:p>
+            <w:pPr>
+              <w:spacing w:before="40" w:after="40" w:line="252" w:lineRule="auto"/>
+            </w:pPr>
+            <w:r>
+              <w:rPr>
+                <w:rFonts w:ascii="Consolas" w:hAnsi="Consolas"/>
+                <w:b w:val="0"/>
+                <w:i w:val="0"/>
+                <w:color w:val="1E293B"/>
+                <w:sz w:val="18"/>
+                <w:rFonts w:ascii="Consolas" w:hAnsi="Consolas" w:cs="Consolas"/>
+              </w:rPr>
+              <w:t>res.status(201).json(createdTask); // Sent immediately</w:t>
+              <w:br/>
+              <w:t>taskEvents.emit('task-created', createdTask); // Background trigger</w:t>
+            </w:r>
+          </w:p>
+        </w:tc>
+      </w:tr>
+    </w:tbl>
     <w:p>
       <w:pPr>
-        <w:spacing w:before="80" w:after="120"/>
-        <w:ind w:left="288"/>
+        <w:spacing w:after="80"/>
+      </w:pPr>
+    </w:p>
+    <w:p>
+      <w:pPr>
+        <w:spacing w:before="240" w:after="80"/>
       </w:pPr>
       <w:r>
         <w:rPr>
-          <w:rFonts w:ascii="Consolas" w:hAnsi="Consolas"/>
-          <w:color w:val="1E293B"/>
-          <w:sz w:val="19"/>
-        </w:rPr>
-        <w:t>res.status(201).json(createdTask); // Sent immediately</w:t>
-        <w:br/>
-        <w:t>taskEvents.emit('task-created', createdTask); // Background trigger</w:t>
-      </w:r>
-    </w:p>
-    <w:p>
-      <w:pPr>
-        <w:spacing w:before="280" w:after="120"/>
-      </w:pPr>
-      <w:r>
-        <w:rPr>
+          <w:rFonts w:ascii="Times New Roman" w:hAnsi="Times New Roman"/>
           <w:b/>
-          <w:sz w:val="40"/>
+          <w:i w:val="0"/>
+          <w:color w:val="0F172A"/>
+          <w:sz w:val="32"/>
+          <w:rFonts w:ascii="Times New Roman" w:hAnsi="Times New Roman" w:cs="Times New Roman"/>
         </w:rPr>
         <w:t>7. Practical Execution and Evidence</w:t>
       </w:r>
     </w:p>
     <w:p>
       <w:pPr>
-        <w:spacing w:after="120" w:line="276" w:lineRule="auto"/>
+        <w:spacing w:after="80" w:line="276" w:lineRule="auto"/>
       </w:pPr>
       <w:r>
         <w:rPr>
+          <w:rFonts w:ascii="Times New Roman" w:hAnsi="Times New Roman"/>
+          <w:b w:val="0"/>
+          <w:i w:val="0"/>
+          <w:color w:val="1E293B"/>
           <w:sz w:val="22"/>
+          <w:rFonts w:ascii="Times New Roman" w:hAnsi="Times New Roman" w:cs="Times New Roman"/>
         </w:rPr>
-        <w:t>The following screenshots demonstrate the verified execution, terminal logs, and live output of the implemented solution:</w:t>
+        <w:t>The following visual evidence records demonstrate the execution, terminal logs, and live output of the implemented practical:</w:t>
       </w:r>
     </w:p>
     <w:p>
       <w:pPr>
-        <w:spacing w:before="160" w:after="80"/>
+        <w:spacing w:before="160" w:after="60"/>
         <w:jc w:val="center"/>
       </w:pPr>
       <w:r>
         <w:drawing>
           <wp:inline xmlns:a="http://schemas.openxmlformats.org/drawingml/2006/main" xmlns:pic="http://schemas.openxmlformats.org/drawingml/2006/picture">
-            <wp:extent cx="5669280" cy="3401568"/>
+            <wp:extent cx="5486400" cy="3291840"/>
             <wp:docPr id="1" name="Picture 1"/>
             <wp:cNvGraphicFramePr>
               <a:graphicFrameLocks noChangeAspect="1"/>
@@ -458,7 +750,7 @@
                     <pic:cNvPicPr/>
                   </pic:nvPicPr>
                   <pic:blipFill>
-                    <a:blip r:embed="rId9"/>
+                    <a:blip r:embed="rId11"/>
                     <a:stretch>
                       <a:fillRect/>
                     </a:stretch>
@@ -466,7 +758,7 @@
                   <pic:spPr>
                     <a:xfrm>
                       <a:off x="0" y="0"/>
-                      <a:ext cx="5669280" cy="3401568"/>
+                      <a:ext cx="5486400" cy="3291840"/>
                     </a:xfrm>
                     <a:prstGeom prst="rect"/>
                   </pic:spPr>
@@ -479,86 +771,117 @@
     </w:p>
     <w:p>
       <w:pPr>
-        <w:spacing w:after="200"/>
+        <w:spacing w:after="160"/>
         <w:jc w:val="center"/>
       </w:pPr>
       <w:r>
         <w:rPr>
+          <w:rFonts w:ascii="Times New Roman" w:hAnsi="Times New Roman"/>
+          <w:b w:val="0"/>
           <w:i/>
-          <w:color w:val="64748B"/>
+          <w:color w:val="475569"/>
           <w:sz w:val="19"/>
+          <w:rFonts w:ascii="Times New Roman" w:hAnsi="Times New Roman" w:cs="Times New Roman"/>
         </w:rPr>
         <w:t>Fig. 10.1: Console timestamp log proving HTTP response was delivered before background notification finished.</w:t>
       </w:r>
     </w:p>
     <w:p>
       <w:pPr>
-        <w:spacing w:before="280" w:after="120"/>
+        <w:spacing w:before="240" w:after="80"/>
       </w:pPr>
       <w:r>
         <w:rPr>
+          <w:rFonts w:ascii="Times New Roman" w:hAnsi="Times New Roman"/>
           <w:b/>
-          <w:sz w:val="40"/>
+          <w:i w:val="0"/>
+          <w:color w:val="0F172A"/>
+          <w:sz w:val="32"/>
+          <w:rFonts w:ascii="Times New Roman" w:hAnsi="Times New Roman" w:cs="Times New Roman"/>
         </w:rPr>
         <w:t>8. Testing and Verification</w:t>
       </w:r>
     </w:p>
     <w:p>
       <w:pPr>
-        <w:pStyle w:val="ListParagraph"/>
+        <w:pStyle w:val="ListBullet"/>
         <w:spacing w:after="60" w:line="276" w:lineRule="auto"/>
       </w:pPr>
       <w:r>
         <w:rPr>
+          <w:rFonts w:ascii="Times New Roman" w:hAnsi="Times New Roman"/>
+          <w:b w:val="0"/>
+          <w:i w:val="0"/>
+          <w:color w:val="1E293B"/>
           <w:sz w:val="22"/>
+          <w:rFonts w:ascii="Times New Roman" w:hAnsi="Times New Roman" w:cs="Times New Roman"/>
         </w:rPr>
         <w:t>Test 1: POST /tasks returns status 201 immediately (&lt; 30ms). [PASS]</w:t>
       </w:r>
     </w:p>
     <w:p>
       <w:pPr>
-        <w:pStyle w:val="ListParagraph"/>
+        <w:pStyle w:val="ListBullet"/>
         <w:spacing w:after="60" w:line="276" w:lineRule="auto"/>
       </w:pPr>
       <w:r>
         <w:rPr>
+          <w:rFonts w:ascii="Times New Roman" w:hAnsi="Times New Roman"/>
+          <w:b w:val="0"/>
+          <w:i w:val="0"/>
+          <w:color w:val="1E293B"/>
           <w:sz w:val="22"/>
+          <w:rFonts w:ascii="Times New Roman" w:hAnsi="Times New Roman" w:cs="Times New Roman"/>
         </w:rPr>
         <w:t>Test 2: 'task-created' event is received and handled without crashing the server. [PASS]</w:t>
       </w:r>
     </w:p>
     <w:p>
       <w:pPr>
-        <w:pStyle w:val="ListParagraph"/>
+        <w:pStyle w:val="ListBullet"/>
         <w:spacing w:after="60" w:line="276" w:lineRule="auto"/>
       </w:pPr>
       <w:r>
         <w:rPr>
+          <w:rFonts w:ascii="Times New Roman" w:hAnsi="Times New Roman"/>
+          <w:b w:val="0"/>
+          <w:i w:val="0"/>
+          <w:color w:val="1E293B"/>
           <w:sz w:val="22"/>
+          <w:rFonts w:ascii="Times New Roman" w:hAnsi="Times New Roman" w:cs="Times New Roman"/>
         </w:rPr>
         <w:t>Test 3: Background notification completes 403ms after HTTP response is closed. [PASS]</w:t>
       </w:r>
     </w:p>
     <w:p>
       <w:pPr>
-        <w:pStyle w:val="ListParagraph"/>
+        <w:pStyle w:val="ListBullet"/>
         <w:spacing w:after="60" w:line="276" w:lineRule="auto"/>
       </w:pPr>
       <w:r>
         <w:rPr>
+          <w:rFonts w:ascii="Times New Roman" w:hAnsi="Times New Roman"/>
+          <w:b w:val="0"/>
+          <w:i w:val="0"/>
+          <w:color w:val="1E293B"/>
           <w:sz w:val="22"/>
+          <w:rFonts w:ascii="Times New Roman" w:hAnsi="Times New Roman" w:cs="Times New Roman"/>
         </w:rPr>
         <w:t>Test 4: DELETE /tasks triggers 'task-deleted' audit event cleanly. [PASS]</w:t>
       </w:r>
     </w:p>
     <w:p>
       <w:pPr>
-        <w:spacing w:before="280" w:after="120"/>
+        <w:spacing w:before="240" w:after="80"/>
       </w:pPr>
       <w:r>
         <w:rPr>
+          <w:rFonts w:ascii="Times New Roman" w:hAnsi="Times New Roman"/>
           <w:b/>
-          <w:sz w:val="40"/>
+          <w:i w:val="0"/>
+          <w:color w:val="0F172A"/>
+          <w:sz w:val="32"/>
+          <w:rFonts w:ascii="Times New Roman" w:hAnsi="Times New Roman" w:cs="Times New Roman"/>
         </w:rPr>
         <w:t>9. Key Questions and Answers (Viva Preparation)</w:t>
       </w:r>
@@ -569,21 +892,30 @@
       </w:pPr>
       <w:r>
         <w:rPr>
+          <w:rFonts w:ascii="Times New Roman" w:hAnsi="Times New Roman"/>
           <w:b/>
+          <w:i w:val="0"/>
+          <w:color w:val="0F172A"/>
           <w:sz w:val="22"/>
+          <w:rFonts w:ascii="Times New Roman" w:hAnsi="Times New Roman" w:cs="Times New Roman"/>
         </w:rPr>
-        <w:t>Q: Why does emitting an event not block the API response even though both run on the same Node.js process?</w:t>
+        <w:t>Q1. Why does emitting an event not block the API response even though both run on the same Node.js process?</w:t>
       </w:r>
     </w:p>
     <w:p>
       <w:pPr>
-        <w:spacing w:after="120"/>
+        <w:spacing w:after="120" w:line="276" w:lineRule="auto"/>
       </w:pPr>
       <w:r>
         <w:rPr>
+          <w:rFonts w:ascii="Times New Roman" w:hAnsi="Times New Roman"/>
+          <w:b w:val="0"/>
+          <w:i w:val="0"/>
+          <w:color w:val="334155"/>
           <w:sz w:val="22"/>
+          <w:rFonts w:ascii="Times New Roman" w:hAnsi="Times New Roman" w:cs="Times New Roman"/>
         </w:rPr>
-        <w:t>A: Because the HTTP socket response is written and closed with res.status(201).json() before the event loop executes the deferred listener timer callback.</w:t>
+        <w:t>Ans: Because the HTTP socket response is written and closed with res.status(201).json() before the event loop executes the deferred listener timer callback.</w:t>
       </w:r>
     </w:p>
     <w:p>
@@ -592,21 +924,30 @@
       </w:pPr>
       <w:r>
         <w:rPr>
+          <w:rFonts w:ascii="Times New Roman" w:hAnsi="Times New Roman"/>
           <w:b/>
+          <w:i w:val="0"/>
+          <w:color w:val="0F172A"/>
           <w:sz w:val="22"/>
+          <w:rFonts w:ascii="Times New Roman" w:hAnsi="Times New Roman" w:cs="Times New Roman"/>
         </w:rPr>
-        <w:t>Q: What would happen to API response time if notification logic was placed synchronously inside the route?</w:t>
+        <w:t>Q2. What would happen to API response time if notification logic was placed synchronously inside the route?</w:t>
       </w:r>
     </w:p>
     <w:p>
       <w:pPr>
-        <w:spacing w:after="120"/>
+        <w:spacing w:after="120" w:line="276" w:lineRule="auto"/>
       </w:pPr>
       <w:r>
         <w:rPr>
+          <w:rFonts w:ascii="Times New Roman" w:hAnsi="Times New Roman"/>
+          <w:b w:val="0"/>
+          <w:i w:val="0"/>
+          <w:color w:val="334155"/>
           <w:sz w:val="22"/>
+          <w:rFonts w:ascii="Times New Roman" w:hAnsi="Times New Roman" w:cs="Times New Roman"/>
         </w:rPr>
-        <w:t>A: Every client request would be stalled by the duration of the notification dispatch (e.g. 400ms to 2000ms), degrading throughput and user experience.</w:t>
+        <w:t>Ans: Every client request would be stalled by the duration of the notification dispatch (e.g. 400ms to 2000ms), degrading throughput and user experience.</w:t>
       </w:r>
     </w:p>
     <w:p>
@@ -615,153 +956,14 @@
       </w:pPr>
       <w:r>
         <w:rPr>
+          <w:rFonts w:ascii="Times New Roman" w:hAnsi="Times New Roman"/>
           <w:b/>
+          <w:i w:val="0"/>
+          <w:color w:val="0F172A"/>
           <w:sz w:val="22"/>
+          <w:rFonts w:ascii="Times New Roman" w:hAnsi="Times New Roman" w:cs="Times New Roman"/>
         </w:rPr>
-        <w:t>Q: Why is EventEmitter suitable for this application scale but not for enterprise systems handling millions of events?</w:t>
-      </w:r>
-    </w:p>
-    <w:p>
-      <w:pPr>
-        <w:spacing w:after="120"/>
-      </w:pPr>
-      <w:r>
-        <w:rPr>
-          <w:sz w:val="22"/>
-        </w:rPr>
-        <w:t>A: EventEmitter is in-memory and process-bound. If the server crashes or reboots, queued events in memory are permanently lost. Enterprise scale requires persistent message brokers like RabbitMQ, Apache Kafka, or BullMQ with Redis.</w:t>
-      </w:r>
-    </w:p>
-    <w:p>
-      <w:pPr>
-        <w:spacing w:before="280" w:after="120"/>
-      </w:pPr>
-      <w:r>
-        <w:rPr>
-          <w:b/>
-          <w:sz w:val="40"/>
-        </w:rPr>
-        <w:t>10. Common Errors and Troubleshooting Guide</w:t>
-      </w:r>
-    </w:p>
-    <w:p>
-      <w:pPr>
-        <w:pStyle w:val="ListParagraph"/>
-        <w:spacing w:after="60" w:line="276" w:lineRule="auto"/>
-      </w:pPr>
-      <w:r>
-        <w:rPr>
-          <w:sz w:val="22"/>
-        </w:rPr>
-        <w:t>Issue: Notification log never appears</w:t>
-      </w:r>
-    </w:p>
-    <w:p>
-      <w:pPr>
-        <w:pStyle w:val="ListParagraph"/>
-        <w:spacing w:after="60" w:line="276" w:lineRule="auto"/>
-      </w:pPr>
-      <w:r>
-        <w:rPr>
-          <w:sz w:val="22"/>
-        </w:rPr>
-        <w:t xml:space="preserve">  • Likely Cause: Listener file never required or registered before event was emitted</w:t>
-      </w:r>
-    </w:p>
-    <w:p>
-      <w:pPr>
-        <w:pStyle w:val="ListParagraph"/>
-        <w:spacing w:after="60" w:line="276" w:lineRule="auto"/>
-      </w:pPr>
-      <w:r>
-        <w:rPr>
-          <w:sz w:val="22"/>
-        </w:rPr>
-        <w:t xml:space="preserve">  • Resolution / Fix: Ensure initializeEventListeners() is called in server.js on startup.</w:t>
-      </w:r>
-    </w:p>
-    <w:p>
-      <w:pPr>
-        <w:pStyle w:val="ListParagraph"/>
-        <w:spacing w:after="60" w:line="276" w:lineRule="auto"/>
-      </w:pPr>
-      <w:r>
-        <w:rPr>
-          <w:sz w:val="22"/>
-        </w:rPr>
-        <w:t>Issue: API response feels delayed</w:t>
-      </w:r>
-    </w:p>
-    <w:p>
-      <w:pPr>
-        <w:pStyle w:val="ListParagraph"/>
-        <w:spacing w:after="60" w:line="276" w:lineRule="auto"/>
-      </w:pPr>
-      <w:r>
-        <w:rPr>
-          <w:sz w:val="22"/>
-        </w:rPr>
-        <w:t xml:space="preserve">  • Likely Cause: Listener logic placed before res.json()</w:t>
-      </w:r>
-    </w:p>
-    <w:p>
-      <w:pPr>
-        <w:pStyle w:val="ListParagraph"/>
-        <w:spacing w:after="60" w:line="276" w:lineRule="auto"/>
-      </w:pPr>
-      <w:r>
-        <w:rPr>
-          <w:sz w:val="22"/>
-        </w:rPr>
-        <w:t xml:space="preserve">  • Resolution / Fix: Always send response before emitting background side-effects.</w:t>
-      </w:r>
-    </w:p>
-    <w:p>
-      <w:pPr>
-        <w:pStyle w:val="ListParagraph"/>
-        <w:spacing w:after="60" w:line="276" w:lineRule="auto"/>
-      </w:pPr>
-      <w:r>
-        <w:rPr>
-          <w:sz w:val="22"/>
-        </w:rPr>
-        <w:t>Issue: Unhandled 'error' event crashes server</w:t>
-      </w:r>
-    </w:p>
-    <w:p>
-      <w:pPr>
-        <w:pStyle w:val="ListParagraph"/>
-        <w:spacing w:after="60" w:line="276" w:lineRule="auto"/>
-      </w:pPr>
-      <w:r>
-        <w:rPr>
-          <w:sz w:val="22"/>
-        </w:rPr>
-        <w:t xml:space="preserve">  • Likely Cause: EventEmitter throws uncaught error if no 'error' listener exists</w:t>
-      </w:r>
-    </w:p>
-    <w:p>
-      <w:pPr>
-        <w:pStyle w:val="ListParagraph"/>
-        <w:spacing w:after="60" w:line="276" w:lineRule="auto"/>
-      </w:pPr>
-      <w:r>
-        <w:rPr>
-          <w:sz w:val="22"/>
-        </w:rPr>
-        <w:t xml:space="preserve">  • Resolution / Fix: Always register taskEvents.on('error', (err) =&gt; console.error(err)).</w:t>
-      </w:r>
-    </w:p>
-    <w:p>
-      <w:pPr>
-        <w:spacing w:before="280" w:after="120"/>
-      </w:pPr>
-      <w:r>
-        <w:rPr>
-          <w:b/>
-          <w:sz w:val="40"/>
-        </w:rPr>
-        <w:t>11. Learning Outcome</w:t>
+        <w:t>Q3. Why is EventEmitter suitable for this application scale but not for enterprise systems handling millions of events?</w:t>
       </w:r>
     </w:p>
     <w:p>
@@ -770,42 +972,305 @@
       </w:pPr>
       <w:r>
         <w:rPr>
+          <w:rFonts w:ascii="Times New Roman" w:hAnsi="Times New Roman"/>
+          <w:b w:val="0"/>
+          <w:i w:val="0"/>
+          <w:color w:val="334155"/>
           <w:sz w:val="22"/>
+          <w:rFonts w:ascii="Times New Roman" w:hAnsi="Times New Roman" w:cs="Times New Roman"/>
+        </w:rPr>
+        <w:t>Ans: EventEmitter is in-memory and process-bound. If the server crashes or reboots, queued events in memory are permanently lost. Enterprise scale requires persistent message brokers like RabbitMQ, Apache Kafka, or BullMQ with Redis.</w:t>
+      </w:r>
+    </w:p>
+    <w:p>
+      <w:pPr>
+        <w:spacing w:before="240" w:after="80"/>
+      </w:pPr>
+      <w:r>
+        <w:rPr>
+          <w:rFonts w:ascii="Times New Roman" w:hAnsi="Times New Roman"/>
+          <w:b/>
+          <w:i w:val="0"/>
+          <w:color w:val="0F172A"/>
+          <w:sz w:val="32"/>
+          <w:rFonts w:ascii="Times New Roman" w:hAnsi="Times New Roman" w:cs="Times New Roman"/>
+        </w:rPr>
+        <w:t>10. Common Errors and Troubleshooting Guide</w:t>
+      </w:r>
+    </w:p>
+    <w:p>
+      <w:pPr>
+        <w:pStyle w:val="ListBullet"/>
+        <w:spacing w:after="60" w:line="276" w:lineRule="auto"/>
+      </w:pPr>
+      <w:r>
+        <w:rPr>
+          <w:rFonts w:ascii="Times New Roman" w:hAnsi="Times New Roman"/>
+          <w:b w:val="0"/>
+          <w:i w:val="0"/>
+          <w:color w:val="1E293B"/>
+          <w:sz w:val="22"/>
+          <w:rFonts w:ascii="Times New Roman" w:hAnsi="Times New Roman" w:cs="Times New Roman"/>
+        </w:rPr>
+        <w:t>Issue: Notification log never appears</w:t>
+      </w:r>
+    </w:p>
+    <w:p>
+      <w:pPr>
+        <w:pStyle w:val="ListBullet"/>
+        <w:spacing w:after="60" w:line="276" w:lineRule="auto"/>
+      </w:pPr>
+      <w:r>
+        <w:rPr>
+          <w:rFonts w:ascii="Times New Roman" w:hAnsi="Times New Roman"/>
+          <w:b w:val="0"/>
+          <w:i w:val="0"/>
+          <w:color w:val="1E293B"/>
+          <w:sz w:val="22"/>
+          <w:rFonts w:ascii="Times New Roman" w:hAnsi="Times New Roman" w:cs="Times New Roman"/>
+        </w:rPr>
+        <w:t xml:space="preserve">  • Likely Cause: Listener file never required or registered before event was emitted</w:t>
+      </w:r>
+    </w:p>
+    <w:p>
+      <w:pPr>
+        <w:pStyle w:val="ListBullet"/>
+        <w:spacing w:after="60" w:line="276" w:lineRule="auto"/>
+      </w:pPr>
+      <w:r>
+        <w:rPr>
+          <w:rFonts w:ascii="Times New Roman" w:hAnsi="Times New Roman"/>
+          <w:b w:val="0"/>
+          <w:i w:val="0"/>
+          <w:color w:val="1E293B"/>
+          <w:sz w:val="22"/>
+          <w:rFonts w:ascii="Times New Roman" w:hAnsi="Times New Roman" w:cs="Times New Roman"/>
+        </w:rPr>
+        <w:t xml:space="preserve">  • Resolution / Fix: Ensure initializeEventListeners() is called in server.js on startup.</w:t>
+      </w:r>
+    </w:p>
+    <w:p>
+      <w:pPr>
+        <w:pStyle w:val="ListBullet"/>
+        <w:spacing w:after="60" w:line="276" w:lineRule="auto"/>
+      </w:pPr>
+      <w:r>
+        <w:rPr>
+          <w:rFonts w:ascii="Times New Roman" w:hAnsi="Times New Roman"/>
+          <w:b w:val="0"/>
+          <w:i w:val="0"/>
+          <w:color w:val="1E293B"/>
+          <w:sz w:val="22"/>
+          <w:rFonts w:ascii="Times New Roman" w:hAnsi="Times New Roman" w:cs="Times New Roman"/>
+        </w:rPr>
+        <w:t>Issue: API response feels delayed</w:t>
+      </w:r>
+    </w:p>
+    <w:p>
+      <w:pPr>
+        <w:pStyle w:val="ListBullet"/>
+        <w:spacing w:after="60" w:line="276" w:lineRule="auto"/>
+      </w:pPr>
+      <w:r>
+        <w:rPr>
+          <w:rFonts w:ascii="Times New Roman" w:hAnsi="Times New Roman"/>
+          <w:b w:val="0"/>
+          <w:i w:val="0"/>
+          <w:color w:val="1E293B"/>
+          <w:sz w:val="22"/>
+          <w:rFonts w:ascii="Times New Roman" w:hAnsi="Times New Roman" w:cs="Times New Roman"/>
+        </w:rPr>
+        <w:t xml:space="preserve">  • Likely Cause: Listener logic placed before res.json()</w:t>
+      </w:r>
+    </w:p>
+    <w:p>
+      <w:pPr>
+        <w:pStyle w:val="ListBullet"/>
+        <w:spacing w:after="60" w:line="276" w:lineRule="auto"/>
+      </w:pPr>
+      <w:r>
+        <w:rPr>
+          <w:rFonts w:ascii="Times New Roman" w:hAnsi="Times New Roman"/>
+          <w:b w:val="0"/>
+          <w:i w:val="0"/>
+          <w:color w:val="1E293B"/>
+          <w:sz w:val="22"/>
+          <w:rFonts w:ascii="Times New Roman" w:hAnsi="Times New Roman" w:cs="Times New Roman"/>
+        </w:rPr>
+        <w:t xml:space="preserve">  • Resolution / Fix: Always send response before emitting background side-effects.</w:t>
+      </w:r>
+    </w:p>
+    <w:p>
+      <w:pPr>
+        <w:pStyle w:val="ListBullet"/>
+        <w:spacing w:after="60" w:line="276" w:lineRule="auto"/>
+      </w:pPr>
+      <w:r>
+        <w:rPr>
+          <w:rFonts w:ascii="Times New Roman" w:hAnsi="Times New Roman"/>
+          <w:b w:val="0"/>
+          <w:i w:val="0"/>
+          <w:color w:val="1E293B"/>
+          <w:sz w:val="22"/>
+          <w:rFonts w:ascii="Times New Roman" w:hAnsi="Times New Roman" w:cs="Times New Roman"/>
+        </w:rPr>
+        <w:t>Issue: Unhandled 'error' event crashes server</w:t>
+      </w:r>
+    </w:p>
+    <w:p>
+      <w:pPr>
+        <w:pStyle w:val="ListBullet"/>
+        <w:spacing w:after="60" w:line="276" w:lineRule="auto"/>
+      </w:pPr>
+      <w:r>
+        <w:rPr>
+          <w:rFonts w:ascii="Times New Roman" w:hAnsi="Times New Roman"/>
+          <w:b w:val="0"/>
+          <w:i w:val="0"/>
+          <w:color w:val="1E293B"/>
+          <w:sz w:val="22"/>
+          <w:rFonts w:ascii="Times New Roman" w:hAnsi="Times New Roman" w:cs="Times New Roman"/>
+        </w:rPr>
+        <w:t xml:space="preserve">  • Likely Cause: EventEmitter throws uncaught error if no 'error' listener exists</w:t>
+      </w:r>
+    </w:p>
+    <w:p>
+      <w:pPr>
+        <w:pStyle w:val="ListBullet"/>
+        <w:spacing w:after="60" w:line="276" w:lineRule="auto"/>
+      </w:pPr>
+      <w:r>
+        <w:rPr>
+          <w:rFonts w:ascii="Times New Roman" w:hAnsi="Times New Roman"/>
+          <w:b w:val="0"/>
+          <w:i w:val="0"/>
+          <w:color w:val="1E293B"/>
+          <w:sz w:val="22"/>
+          <w:rFonts w:ascii="Times New Roman" w:hAnsi="Times New Roman" w:cs="Times New Roman"/>
+        </w:rPr>
+        <w:t xml:space="preserve">  • Resolution / Fix: Always register taskEvents.on('error', (err) =&gt; console.error(err)).</w:t>
+      </w:r>
+    </w:p>
+    <w:p>
+      <w:pPr>
+        <w:spacing w:before="240" w:after="80"/>
+      </w:pPr>
+      <w:r>
+        <w:rPr>
+          <w:rFonts w:ascii="Times New Roman" w:hAnsi="Times New Roman"/>
+          <w:b/>
+          <w:i w:val="0"/>
+          <w:color w:val="0F172A"/>
+          <w:sz w:val="32"/>
+          <w:rFonts w:ascii="Times New Roman" w:hAnsi="Times New Roman" w:cs="Times New Roman"/>
+        </w:rPr>
+        <w:t>11. Learning Outcome</w:t>
+      </w:r>
+    </w:p>
+    <w:p>
+      <w:pPr>
+        <w:spacing w:after="80" w:line="276" w:lineRule="auto"/>
+      </w:pPr>
+      <w:r>
+        <w:rPr>
+          <w:rFonts w:ascii="Times New Roman" w:hAnsi="Times New Roman"/>
+          <w:b w:val="0"/>
+          <w:i w:val="0"/>
+          <w:color w:val="1E293B"/>
+          <w:sz w:val="22"/>
+          <w:rFonts w:ascii="Times New Roman" w:hAnsi="Times New Roman" w:cs="Times New Roman"/>
         </w:rPr>
         <w:t>I successfully built a non-blocking background notification and audit system using Node.js native EventEmitter and proved asynchronous decoupling using precise timestamp ordering.</w:t>
       </w:r>
     </w:p>
     <w:p>
       <w:pPr>
-        <w:spacing w:before="280" w:after="120"/>
+        <w:spacing w:before="240" w:after="80"/>
       </w:pPr>
       <w:r>
         <w:rPr>
+          <w:rFonts w:ascii="Times New Roman" w:hAnsi="Times New Roman"/>
           <w:b/>
-          <w:sz w:val="40"/>
+          <w:i w:val="0"/>
+          <w:color w:val="0F172A"/>
+          <w:sz w:val="32"/>
+          <w:rFonts w:ascii="Times New Roman" w:hAnsi="Times New Roman" w:cs="Times New Roman"/>
         </w:rPr>
         <w:t>12. Student Reflection</w:t>
       </w:r>
     </w:p>
     <w:p>
       <w:pPr>
-        <w:spacing w:after="120" w:line="276" w:lineRule="auto"/>
+        <w:spacing w:after="80" w:line="276" w:lineRule="auto"/>
       </w:pPr>
       <w:r>
         <w:rPr>
+          <w:rFonts w:ascii="Times New Roman" w:hAnsi="Times New Roman"/>
+          <w:b w:val="0"/>
+          <w:i w:val="0"/>
+          <w:color w:val="1E293B"/>
           <w:sz w:val="22"/>
+          <w:rFonts w:ascii="Times New Roman" w:hAnsi="Times New Roman" w:cs="Times New Roman"/>
         </w:rPr>
         <w:t>Mastering Node's event-driven paradigm clarified how asynchronous I/O and non-blocking event loops power high-concurrency web services.</w:t>
       </w:r>
     </w:p>
     <w:sectPr>
+      <w:headerReference w:type="default" r:id="rId9"/>
+      <w:footerReference w:type="default" r:id="rId10"/>
       <w:pgSz w:w="12240" w:h="15840"/>
-      <w:pgMar w:top="1080" w:right="1080" w:bottom="1080" w:left="1080" w:header="720" w:footer="720" w:gutter="0"/>
+      <w:pgMar w:top="936" w:right="1080" w:bottom="936" w:left="1080" w:header="720" w:footer="720" w:gutter="0"/>
       <w:cols w:space="720"/>
       <w:docGrid w:linePitch="360"/>
     </w:sectPr>
   </w:body>
 </w:document>
+</file>
+
+<file path=word/footer1.xml><?xml version="1.0" encoding="utf-8"?>
+<w:ftr xmlns:m="http://schemas.openxmlformats.org/officeDocument/2006/math" xmlns:mc="http://schemas.openxmlformats.org/markup-compatibility/2006" xmlns:mo="http://schemas.microsoft.com/office/mac/office/2008/main" xmlns:mv="urn:schemas-microsoft-com:mac:vml" xmlns:o="urn:schemas-microsoft-com:office:office" xmlns:r="http://schemas.openxmlformats.org/officeDocument/2006/relationships" xmlns:v="urn:schemas-microsoft-com:vml" xmlns:w10="urn:schemas-microsoft-com:office:word" xmlns:w14="http://schemas.microsoft.com/office/word/2010/wordml" xmlns:w="http://schemas.openxmlformats.org/wordprocessingml/2006/main" xmlns:wne="http://schemas.microsoft.com/office/word/2006/wordml" xmlns:wp14="http://schemas.microsoft.com/office/word/2010/wordprocessingDrawing" xmlns:wp="http://schemas.openxmlformats.org/drawingml/2006/wordprocessingDrawing" xmlns:wpc="http://schemas.microsoft.com/office/word/2010/wordprocessingCanvas" xmlns:wpg="http://schemas.microsoft.com/office/word/2010/wordprocessingGroup" xmlns:wpi="http://schemas.microsoft.com/office/word/2010/wordprocessingInk" xmlns:wps="http://schemas.microsoft.com/office/word/2010/wordprocessingShape" mc:Ignorable="w14 wp14">
+  <w:p>
+    <w:pPr>
+      <w:pStyle w:val="Footer"/>
+      <w:jc w:val="center"/>
+    </w:pPr>
+    <w:r/>
+    <w:r>
+      <w:rPr>
+        <w:rFonts w:ascii="Times New Roman" w:hAnsi="Times New Roman"/>
+        <w:b w:val="0"/>
+        <w:i/>
+        <w:color w:val="64748B"/>
+        <w:sz w:val="19"/>
+        <w:rFonts w:ascii="Times New Roman" w:hAnsi="Times New Roman" w:cs="Times New Roman"/>
+      </w:rPr>
+      <w:t>24DIT021 | CHARUSAT DEPSTAR IT</w:t>
+    </w:r>
+  </w:p>
+</w:ftr>
+</file>
+
+<file path=word/header1.xml><?xml version="1.0" encoding="utf-8"?>
+<w:hdr xmlns:m="http://schemas.openxmlformats.org/officeDocument/2006/math" xmlns:mc="http://schemas.openxmlformats.org/markup-compatibility/2006" xmlns:mo="http://schemas.microsoft.com/office/mac/office/2008/main" xmlns:mv="urn:schemas-microsoft-com:mac:vml" xmlns:o="urn:schemas-microsoft-com:office:office" xmlns:r="http://schemas.openxmlformats.org/officeDocument/2006/relationships" xmlns:v="urn:schemas-microsoft-com:vml" xmlns:w10="urn:schemas-microsoft-com:office:word" xmlns:w14="http://schemas.microsoft.com/office/word/2010/wordml" xmlns:w="http://schemas.openxmlformats.org/wordprocessingml/2006/main" xmlns:wne="http://schemas.microsoft.com/office/word/2006/wordml" xmlns:wp14="http://schemas.microsoft.com/office/word/2010/wordprocessingDrawing" xmlns:wp="http://schemas.openxmlformats.org/drawingml/2006/wordprocessingDrawing" xmlns:wpc="http://schemas.microsoft.com/office/word/2010/wordprocessingCanvas" xmlns:wpg="http://schemas.microsoft.com/office/word/2010/wordprocessingGroup" xmlns:wpi="http://schemas.microsoft.com/office/word/2010/wordprocessingInk" xmlns:wps="http://schemas.microsoft.com/office/word/2010/wordprocessingShape" mc:Ignorable="w14 wp14">
+  <w:p>
+    <w:pPr>
+      <w:pStyle w:val="Header"/>
+      <w:jc w:val="right"/>
+    </w:pPr>
+    <w:r/>
+    <w:r>
+      <w:rPr>
+        <w:rFonts w:ascii="Times New Roman" w:hAnsi="Times New Roman"/>
+        <w:b/>
+        <w:i w:val="0"/>
+        <w:color w:val="475569"/>
+        <w:sz w:val="20"/>
+        <w:rFonts w:ascii="Times New Roman" w:hAnsi="Times New Roman" w:cs="Times New Roman"/>
+      </w:rPr>
+      <w:t>24DIT021</w:t>
+    </w:r>
+  </w:p>
+</w:hdr>
 </file>
 
 <file path=word/numbering.xml><?xml version="1.0" encoding="utf-8"?>

</xml_diff>